<commit_message>
Docs: S-eq (PPO + MMD) is the main silent baseline, S-ind secondary
- Research design: two silent baselines, equilibrium-value reading of ΔGood (cheap talk can change the value
  of a two-team zero-sum game), exploitability and cross-seed play as preconditions, refs [14]-[16]
- Implementation spec: MMD loss and magnet, alpha/K pilot, best-response protocol, B = 1.5M, CPU training
- README: status, config ladder and commands for S-eq; pyproject gains a docs extra (python-docx)

Co-Authored-By: Claude Opus 5.5 <noreply@anthropic.com>
</commit_message>
<xml_diff>
--- a/docs/Avalon_Implementation_Spec.docx
+++ b/docs/Avalon_Implementation_Spec.docx
@@ -20,7 +20,7 @@
     </w:p>
     <w:p>
       <w:r>
-        <w:t>CS7329 Reinforcement Learning ｜ 实现方案 ｜ 2026年10月20日 ｜ 配套：《研究设计》</w:t>
+        <w:t>CS7329 Reinforcement Learning ｜ 实现方案 ｜ 2026年10月28日 ｜ 配套：《研究设计》</w:t>
       </w:r>
     </w:p>
     <w:p>
@@ -33,7 +33,7 @@
     </w:p>
     <w:p>
       <w:r>
-        <w:t>本文件只记录怎么实现。配置名称（S、M、M+k、F）与实验条件（如 F → S）的定义见《研究设计》第 5 节。</w:t>
+        <w:t>本文件只记录怎么实现。配置名称（S-eq、S-ind、M、M+k、F）与实验条件（如 F → S）的定义见《研究设计》第 5 节；S 不加说明时指主基线 S-eq。</w:t>
       </w:r>
     </w:p>
     <w:tbl>
@@ -286,7 +286,7 @@
               <w:rPr>
                 <w:sz w:val="19"/>
               </w:rPr>
-              <w:t>信息状态向量上的 MLP actor–critic、带掩码的统一动作空间、PPO 与 GAE、self-play 对手池、沉默优先的分支训练</w:t>
+              <w:t>信息状态向量上的 MLP actor–critic、带掩码的统一动作空间、PPO 与 GAE、MMD 正则（S-eq 及各通信配置）、self-play 对手池、沉默优先的分支训练</w:t>
             </w:r>
           </w:p>
         </w:tc>
@@ -346,7 +346,7 @@
               <w:rPr>
                 <w:sz w:val="19"/>
               </w:rPr>
-              <w:t>S、M、F，各 3 个种子</w:t>
+              <w:t>S-eq、S-ind、M、F，各 3 个种子</w:t>
             </w:r>
           </w:p>
         </w:tc>
@@ -406,7 +406,7 @@
               <w:rPr>
                 <w:sz w:val="19"/>
               </w:rPr>
-              <w:t>三项通信诊断、冻结评估、按种子配对的 bootstrap</w:t>
+              <w:t>三项通信诊断、冻结评估、近似可利用度、跨种子交叉对战、按种子配对的 bootstrap</w:t>
             </w:r>
           </w:p>
         </w:tc>
@@ -424,7 +424,7 @@
               <w:rPr>
                 <w:sz w:val="19"/>
               </w:rPr>
-              <w:t>跨种子交叉对战</w:t>
+              <w:t>从头训练的最优反应</w:t>
             </w:r>
           </w:p>
         </w:tc>
@@ -1382,6 +1382,71 @@
       </w:r>
     </w:p>
     <w:p>
+      <w:r>
+        <w:rPr>
+          <w:b/>
+        </w:rPr>
+        <w:t>MMD 正则（S-eq 与各通信配置）：</w:t>
+      </w:r>
+      <w:r/>
+    </w:p>
+    <w:p>
+      <w:pPr>
+        <w:pStyle w:val="ListBullet"/>
+      </w:pPr>
+      <w:r>
+        <w:rPr>
+          <w:b/>
+        </w:rPr>
+        <w:t>损失：</w:t>
+      </w:r>
+      <w:r>
+        <w:t>在 PPO 损失上加 α · KL(π ‖ π_magnet)，KL 只在合法动作上计算，与熵项并存。[11]</w:t>
+      </w:r>
+    </w:p>
+    <w:p>
+      <w:pPr>
+        <w:pStyle w:val="ListBullet"/>
+      </w:pPr>
+      <w:r>
+        <w:rPr>
+          <w:b/>
+        </w:rPr>
+        <w:t>magnet：</w:t>
+      </w:r>
+      <w:r>
+        <w:t>默认为移动 magnet：每个阵营一份冻结的策略副本，每 K 次迭代用当前策略刷新；它随训练逐步靠近均衡，正则把策略拉向上一个 magnet，抑制 self-play 的循环。另一种是均匀 magnet，等价于加大熵正则，收敛到熵正则化的均衡（QRE）。magnet 存入 checkpoint，resume 时原样恢复。</w:t>
+      </w:r>
+    </w:p>
+    <w:p>
+      <w:pPr>
+        <w:pStyle w:val="ListBullet"/>
+      </w:pPr>
+      <w:r>
+        <w:rPr>
+          <w:b/>
+        </w:rPr>
+        <w:t>选参 pilot：</w:t>
+      </w:r>
+      <w:r>
+        <w:t>种子 0 各训练 296,960 局（580 次迭代，与 S-ind 的 checkpoint_00580 对齐）：移动 magnet 的 α ∈ {0.03, 0.1, 0.3}（K＝50，约 2.6 万局刷新一次），以及均匀 magnet、α＝0.1。按近似可利用度选最低的一组，对规则对手的胜率作为平手时的依据；同时测 S-ind 在同一局数下的可利用度作参照。</w:t>
+      </w:r>
+    </w:p>
+    <w:p>
+      <w:pPr>
+        <w:pStyle w:val="ListBullet"/>
+      </w:pPr>
+      <w:r>
+        <w:rPr>
+          <w:b/>
+        </w:rPr>
+        <w:t>S-ind：</w:t>
+      </w:r>
+      <w:r>
+        <w:t>与 S-eq 完全相同，只是关闭 MMD。</w:t>
+      </w:r>
+    </w:p>
+    <w:p>
       <w:pPr>
         <w:pStyle w:val="Heading1"/>
       </w:pPr>
@@ -1400,7 +1465,7 @@
         <w:t>第 1 步 沉默基线：</w:t>
       </w:r>
       <w:r>
-        <w:t>先训练 S，直到对随机与规则对手的胜率稳定（关卡一）。S 不过关时不训练任何通信配置，先排查环境、奖励、掩码与 credit assignment。</w:t>
+        <w:t>先训练 S-eq 与 S-ind，直到对规则对手的胜率稳定（关卡一：最后 10 万局与之前 10 万局的均值相差 &lt; 0.02）。S-eq 还需在可利用度上不劣于同局数的 S-ind。S 不过关时不训练任何通信配置，先排查环境、奖励、掩码与 credit assignment。</w:t>
       </w:r>
     </w:p>
     <w:p>
@@ -1414,7 +1479,7 @@
         <w:t>第 2 步 分支：</w:t>
       </w:r>
       <w:r>
-        <w:t>每个种子把 S 训练到总预算 B 的一半，作为分支点。S 从分支点继续训练剩余一半；M、F 以及扩展层的 M+k 从同一分支点加入消息头，再训练相同局数。新增的消息输入权重初始化为零，使分支时的行为与 S 完全相同；消息输出头从均匀分布起步。</w:t>
+        <w:t>每个种子把 S-eq 训练到总预算 B 的一半，作为分支点（magnet 一并继承）。S 从分支点继续训练剩余一半；M、F 以及扩展层的 M+k 从同一分支点加入消息头，再训练相同局数。新增的消息输入权重初始化为零，使分支时的行为与 S 完全相同；消息输出头从均匀分布起步。</w:t>
       </w:r>
     </w:p>
     <w:p>
@@ -1442,7 +1507,7 @@
         <w:t>预算：</w:t>
       </w:r>
       <w:r>
-        <w:t>每个配置先跑 2,000 局 pilot，测吞吐与学习曲线，再在 20,000–100,000 局范围内选定 B。核心层 S、M、F 各 3 个种子，共 9 次训练，分支设计下前半段共享；扩展层 M+k 各 3 个种子。</w:t>
+        <w:t>B＝150 万局（S-ind 在 100 万局时仍有种子未稳定，150 万局时对规则对手的六项检查全部稳定），分支点为 750k 局附近的 checkpoint_01460。核心层 S-eq、M、F 各 3 个种子，分支设计下前半段共享；S-ind 3 个种子独立训练；扩展层 M+k 各 3 个种子。</w:t>
       </w:r>
     </w:p>
     <w:p>
@@ -1623,10 +1688,24 @@
         <w:rPr>
           <w:b/>
         </w:rPr>
-        <w:t>交叉对战（可选）：</w:t>
+        <w:t>近似可利用度：</w:t>
       </w:r>
       <w:r>
-        <w:t>让不同种子的好人与坏人对局，用于区分策略强弱、共同适应与通信效果。</w:t>
+        <w:t>对每个种子的最终 checkpoint，分别冻结好人与坏人，从该 checkpoint 自身对应阵营的网络出发，用相同的 PPO 设置训练 10 万局最优反应，再在 1,000 局固定评估表上测胜率；可利用度＝BR 好人胜率＋BR 坏人胜率－1。所有配置使用同一 BR 预算与初始化，只做相对比较。[12] 可选：从头训练的 BR，检查初始化的影响。</w:t>
+      </w:r>
+    </w:p>
+    <w:p>
+      <w:pPr>
+        <w:pStyle w:val="ListBullet"/>
+      </w:pPr>
+      <w:r>
+        <w:rPr>
+          <w:b/>
+        </w:rPr>
+        <w:t>交叉对战：</w:t>
+      </w:r>
+      <w:r>
+        <w:t>每个配置都报告 3 × 3 的好人 i 对坏人 j 矩阵（各 1,000 局配对对局），分别汇总同种子对角线与跨种子非对角线；ΔGood 同时在两者上报告。</w:t>
       </w:r>
     </w:p>
     <w:p>
@@ -1661,7 +1740,7 @@
         <w:t>本地优先：</w:t>
       </w:r>
       <w:r>
-        <w:t>RTX 5070 Ti Laptop（12 GB 显存）运行引擎、并行环境、小型网络与统计分析。先分别计时 CPU 仿真与 GPU 更新，不默认瓶颈在 GPU。PyTorch 需选用支持 RTX 50 系的 CUDA 12.8 版本。</w:t>
+        <w:t>远程 Windows 游戏本（Ryzen 9 8945HX 16 核、RTX 5070 Ti Laptop 12 GB）。实测网络较小时 CPU 训练更快，GPU 同步还曾导致挂起，因此训练与最优反应都用 CPU：每个进程 4 线程，多个种子或配置并行。PyTorch 选用支持 RTX 50 系的 CUDA 12.8 版本，以备更大的网络。</w:t>
       </w:r>
     </w:p>
     <w:p>
@@ -1675,7 +1754,7 @@
         <w:t>预算：</w:t>
       </w:r>
       <w:r>
-        <w:t>训练时间约为 配置数 × 种子数 × B × 每局训练耗时（分支设计下前半段共享），另加调参与评估。初始上限设为 40–60 GPU 小时，用 pilot 修订；超出时先减小 B，保留种子数。</w:t>
+        <w:t>训练时间约为 配置数 × 种子数 × B × 每局训练耗时（分支设计下前半段共享），另加调参与评估。实测 S-ind 每 50 万局、3 个种子并行约 2–2.5 小时；每次 10 万局的最优反应约 15–20 分钟。超出预算时先减小 B，保留种子数。</w:t>
       </w:r>
     </w:p>
     <w:p>
@@ -2038,6 +2117,58 @@
         </w:r>
       </w:hyperlink>
     </w:p>
+    <w:p>
+      <w:pPr>
+        <w:spacing w:after="100" w:line="264" w:lineRule="auto"/>
+      </w:pPr>
+      <w:r>
+        <w:rPr>
+          <w:sz w:val="18"/>
+        </w:rPr>
+        <w:t>[11] Sokota, S., D'Orazio, R., Kolter, J. Z., Loizou, N., Lanctot, M., Mitliagkas, I., Brown, N., &amp; Kroer, C. (2023). A Unified Approach to Reinforcement Learning, Quantal Response Equilibria, and Two-Player Zero-Sum Games. ICLR 2023.</w:t>
+      </w:r>
+      <w:r>
+        <w:rPr>
+          <w:sz w:val="18"/>
+        </w:rPr>
+        <w:t xml:space="preserve"> </w:t>
+      </w:r>
+      <w:hyperlink r:id="rId20">
+        <w:r>
+          <w:rPr>
+            <w:color w:val="24567A"/>
+            <w:sz w:val="18"/>
+          </w:rPr>
+          <w:t>原文链接</w:t>
+        </w:r>
+      </w:hyperlink>
+    </w:p>
+    <w:p>
+      <w:pPr>
+        <w:spacing w:after="100" w:line="264" w:lineRule="auto"/>
+      </w:pPr>
+      <w:r>
+        <w:rPr>
+          <w:sz w:val="18"/>
+        </w:rPr>
+        <w:t>[12] Timbers, F., Bard, N., Lockhart, E., Lanctot, M., Schmid, M., Burch, N., Schrittwieser, J., Hubert, T., &amp; Bowling, M. (2022). Approximate Exploitability: Learning a Best Response. IJCAI 2022.</w:t>
+      </w:r>
+      <w:r>
+        <w:rPr>
+          <w:sz w:val="18"/>
+        </w:rPr>
+        <w:t xml:space="preserve"> </w:t>
+      </w:r>
+      <w:hyperlink r:id="rId21">
+        <w:r>
+          <w:rPr>
+            <w:color w:val="24567A"/>
+            <w:sz w:val="18"/>
+          </w:rPr>
+          <w:t>原文链接</w:t>
+        </w:r>
+      </w:hyperlink>
+    </w:p>
     <w:sectPr>
       <w:footerReference w:type="default" r:id="rId9"/>
       <w:pgSz w:w="11909" w:h="16834"/>

</xml_diff>

<commit_message>
Fix the final baseline: silent self-play S (3 seeds x 1.5M games); archive S-eq
- configs/baseline_silent.yaml: the settings of the final run (1.5M games, CPU), branch point checkpoint_01460
- results/tables/baseline_silent_final.json: paired eval, plateau checks, cross-seed matrix, exploitability
  diagnostic and SHA-256 of each seed's latest.pt and checkpoint_01460.pt
- docs and README back to a single silent baseline; cross-seed evaluation (not training) is required for every
  configuration; Nash equilibrium is not a target (PPO + MMD reached exploitability 0.60 vs 0.65)
- configs/baseline_eq.yaml kept as an archived experiment; MMD and best-response code stay as optional tools

Co-Authored-By: Claude Opus 5.5 <noreply@anthropic.com>
</commit_message>
<xml_diff>
--- a/docs/Avalon_Implementation_Spec.docx
+++ b/docs/Avalon_Implementation_Spec.docx
@@ -33,7 +33,7 @@
     </w:p>
     <w:p>
       <w:r>
-        <w:t>本文件只记录怎么实现。配置名称（S-eq、S-ind、M、M+k、F）与实验条件（如 F → S）的定义见《研究设计》第 5 节；S 不加说明时指主基线 S-eq。</w:t>
+        <w:t>本文件只记录怎么实现。配置名称（S、M、M+k、F）与实验条件（如 F → S）的定义见《研究设计》第 5 节。</w:t>
       </w:r>
     </w:p>
     <w:tbl>
@@ -286,7 +286,7 @@
               <w:rPr>
                 <w:sz w:val="19"/>
               </w:rPr>
-              <w:t>信息状态向量上的 MLP actor–critic、带掩码的统一动作空间、PPO 与 GAE、MMD 正则（S-eq 及各通信配置）、self-play 对手池、沉默优先的分支训练</w:t>
+              <w:t>信息状态向量上的 MLP actor–critic、带掩码的统一动作空间、PPO 与 GAE、self-play 对手池、沉默优先的分支训练</w:t>
             </w:r>
           </w:p>
         </w:tc>
@@ -346,7 +346,7 @@
               <w:rPr>
                 <w:sz w:val="19"/>
               </w:rPr>
-              <w:t>S-eq、S-ind、M、F，各 3 个种子</w:t>
+              <w:t>S、M、F，各 3 个种子</w:t>
             </w:r>
           </w:p>
         </w:tc>
@@ -406,7 +406,7 @@
               <w:rPr>
                 <w:sz w:val="19"/>
               </w:rPr>
-              <w:t>三项通信诊断、冻结评估、近似可利用度、跨种子交叉对战、按种子配对的 bootstrap</w:t>
+              <w:t>三项通信诊断、冻结评估、跨种子评估、按种子配对的 bootstrap</w:t>
             </w:r>
           </w:p>
         </w:tc>
@@ -424,7 +424,7 @@
               <w:rPr>
                 <w:sz w:val="19"/>
               </w:rPr>
-              <w:t>从头训练的最优反应</w:t>
+              <w:t>近似可利用度（诊断）</w:t>
             </w:r>
           </w:p>
         </w:tc>
@@ -1382,71 +1382,6 @@
       </w:r>
     </w:p>
     <w:p>
-      <w:r>
-        <w:rPr>
-          <w:b/>
-        </w:rPr>
-        <w:t>MMD 正则（S-eq 与各通信配置）：</w:t>
-      </w:r>
-      <w:r/>
-    </w:p>
-    <w:p>
-      <w:pPr>
-        <w:pStyle w:val="ListBullet"/>
-      </w:pPr>
-      <w:r>
-        <w:rPr>
-          <w:b/>
-        </w:rPr>
-        <w:t>损失：</w:t>
-      </w:r>
-      <w:r>
-        <w:t>在 PPO 损失上加 α · KL(π ‖ π_magnet)，KL 只在合法动作上计算，与熵项并存。[11]</w:t>
-      </w:r>
-    </w:p>
-    <w:p>
-      <w:pPr>
-        <w:pStyle w:val="ListBullet"/>
-      </w:pPr>
-      <w:r>
-        <w:rPr>
-          <w:b/>
-        </w:rPr>
-        <w:t>magnet：</w:t>
-      </w:r>
-      <w:r>
-        <w:t>默认为移动 magnet：每个阵营一份冻结的策略副本，每 K 次迭代用当前策略刷新；它随训练逐步靠近均衡，正则把策略拉向上一个 magnet，抑制 self-play 的循环。另一种是均匀 magnet，等价于加大熵正则，收敛到熵正则化的均衡（QRE）。magnet 存入 checkpoint，resume 时原样恢复。</w:t>
-      </w:r>
-    </w:p>
-    <w:p>
-      <w:pPr>
-        <w:pStyle w:val="ListBullet"/>
-      </w:pPr>
-      <w:r>
-        <w:rPr>
-          <w:b/>
-        </w:rPr>
-        <w:t>选参 pilot：</w:t>
-      </w:r>
-      <w:r>
-        <w:t>种子 0 各训练 296,960 局（580 次迭代，与 S-ind 的 checkpoint_00580 对齐）：移动 magnet 的 α ∈ {0.03, 0.1, 0.3}（K＝50，约 2.6 万局刷新一次），以及均匀 magnet、α＝0.1。按近似可利用度选最低的一组，对规则对手的胜率作为平手时的依据；同时测 S-ind 在同一局数下的可利用度作参照。</w:t>
-      </w:r>
-    </w:p>
-    <w:p>
-      <w:pPr>
-        <w:pStyle w:val="ListBullet"/>
-      </w:pPr>
-      <w:r>
-        <w:rPr>
-          <w:b/>
-        </w:rPr>
-        <w:t>S-ind：</w:t>
-      </w:r>
-      <w:r>
-        <w:t>与 S-eq 完全相同，只是关闭 MMD。</w:t>
-      </w:r>
-    </w:p>
-    <w:p>
       <w:pPr>
         <w:pStyle w:val="Heading1"/>
       </w:pPr>
@@ -1465,7 +1400,7 @@
         <w:t>第 1 步 沉默基线：</w:t>
       </w:r>
       <w:r>
-        <w:t>先训练 S-eq 与 S-ind，直到对规则对手的胜率稳定（关卡一：最后 10 万局与之前 10 万局的均值相差 &lt; 0.02）。S-eq 还需在可利用度上不劣于同局数的 S-ind。S 不过关时不训练任何通信配置，先排查环境、奖励、掩码与 credit assignment。</w:t>
+        <w:t>先训练 S，直到对规则对手的胜率稳定（关卡一：最后约 10 万局与之前约 10 万局的均值相差 &lt; 0.02）。S 不过关时不训练任何通信配置，先排查环境、奖励、掩码与 credit assignment。</w:t>
       </w:r>
     </w:p>
     <w:p>
@@ -1479,7 +1414,7 @@
         <w:t>第 2 步 分支：</w:t>
       </w:r>
       <w:r>
-        <w:t>每个种子把 S-eq 训练到总预算 B 的一半，作为分支点（magnet 一并继承）。S 从分支点继续训练剩余一半；M、F 以及扩展层的 M+k 从同一分支点加入消息头，再训练相同局数。新增的消息输入权重初始化为零，使分支时的行为与 S 完全相同；消息输出头从均匀分布起步。</w:t>
+        <w:t>每个种子把 S 训练到总预算 B 的一半，作为分支点。S 从分支点继续训练剩余一半；M、F 以及扩展层的 M+k 从同一分支点加入消息头，再训练相同局数。新增的消息输入权重初始化为零，使分支时的行为与 S 完全相同；消息输出头从均匀分布起步。</w:t>
       </w:r>
     </w:p>
     <w:p>
@@ -1507,7 +1442,7 @@
         <w:t>预算：</w:t>
       </w:r>
       <w:r>
-        <w:t>B＝150 万局（S-ind 在 100 万局时仍有种子未稳定，150 万局时对规则对手的六项检查全部稳定），分支点为 750k 局附近的 checkpoint_01460。核心层 S-eq、M、F 各 3 个种子，分支设计下前半段共享；S-ind 3 个种子独立训练；扩展层 M+k 各 3 个种子。</w:t>
+        <w:t>B＝150 万局（2,930 次迭代，每次 512 局）。S 在 100 万局时仍有种子未稳定，150 万局时对规则对手的六项检查全部稳定。分支点为约 75 万局的 checkpoint_01460（747,520 局）。核心层 S、M、F 各 3 个种子，分支设计下前半段共享；扩展层 M+k 各 3 个种子。</w:t>
       </w:r>
     </w:p>
     <w:p>
@@ -1688,10 +1623,10 @@
         <w:rPr>
           <w:b/>
         </w:rPr>
-        <w:t>近似可利用度：</w:t>
+        <w:t>跨种子评估：</w:t>
       </w:r>
       <w:r>
-        <w:t>对每个种子的最终 checkpoint，分别冻结好人与坏人，从该 checkpoint 自身对应阵营的网络出发，用相同的 PPO 设置训练 10 万局最优反应，再在 1,000 局固定评估表上测胜率；可利用度＝BR 好人胜率＋BR 坏人胜率－1。所有配置使用同一 BR 预算与初始化，只做相对比较。[12] 可选：从头训练的 BR，检查初始化的影响。</w:t>
+        <w:t>每个配置都用 scripts/crossplay.py 报告 3 × 3 的好人 i 对坏人 j 矩阵（各 1,000 局配对对局），分别汇总同种子对角线与跨种子非对角线；ΔGood 同时在两者上报告。只做评估，不做跨种子训练。</w:t>
       </w:r>
     </w:p>
     <w:p>
@@ -1702,10 +1637,10 @@
         <w:rPr>
           <w:b/>
         </w:rPr>
-        <w:t>交叉对战：</w:t>
+        <w:t>近似可利用度（可选诊断）：</w:t>
       </w:r>
       <w:r>
-        <w:t>每个配置都报告 3 × 3 的好人 i 对坏人 j 矩阵（各 1,000 局配对对局），分别汇总同种子对角线与跨种子非对角线；ΔGood 同时在两者上报告。</w:t>
+        <w:t>冻结一方，从该 checkpoint 自身对应阵营的网络出发，用相同的 PPO 设置训练 10 万局最优反应，可利用度＝BR 好人胜率＋BR 坏人胜率－1（scripts/best_response.py、exploitability.py）。[11] 只作诊断，不作训练目标或关卡。</w:t>
       </w:r>
     </w:p>
     <w:p>
@@ -1740,7 +1675,7 @@
         <w:t>本地优先：</w:t>
       </w:r>
       <w:r>
-        <w:t>远程 Windows 游戏本（Ryzen 9 8945HX 16 核、RTX 5070 Ti Laptop 12 GB）。实测网络较小时 CPU 训练更快，GPU 同步还曾导致挂起，因此训练与最优反应都用 CPU：每个进程 4 线程，多个种子或配置并行。PyTorch 选用支持 RTX 50 系的 CUDA 12.8 版本，以备更大的网络。</w:t>
+        <w:t>远程 Windows 游戏本（Ryzen 9 8945HX 16 核、RTX 5070 Ti Laptop 12 GB）。实测网络较小时 CPU 训练更快，GPU 同步还曾导致挂起，因此训练用 CPU：每个进程 4 线程，多个种子并行。PyTorch 选用支持 RTX 50 系的 CUDA 12.8 版本，以备更大的网络。</w:t>
       </w:r>
     </w:p>
     <w:p>
@@ -1754,7 +1689,7 @@
         <w:t>预算：</w:t>
       </w:r>
       <w:r>
-        <w:t>训练时间约为 配置数 × 种子数 × B × 每局训练耗时（分支设计下前半段共享），另加调参与评估。实测 S-ind 每 50 万局、3 个种子并行约 2–2.5 小时；每次 10 万局的最优反应约 15–20 分钟。超出预算时先减小 B，保留种子数。</w:t>
+        <w:t>训练时间约为 配置数 × 种子数 × B × 每局训练耗时（分支设计下前半段共享），另加调参与评估。实测 3 个种子并行时每 50 万局约 2–2.5 小时，完整的 150 万局约 6 小时。超出预算时先减小 B，保留种子数。</w:t>
       </w:r>
     </w:p>
     <w:p>
@@ -2125,7 +2060,7 @@
         <w:rPr>
           <w:sz w:val="18"/>
         </w:rPr>
-        <w:t>[11] Sokota, S., D'Orazio, R., Kolter, J. Z., Loizou, N., Lanctot, M., Mitliagkas, I., Brown, N., &amp; Kroer, C. (2023). A Unified Approach to Reinforcement Learning, Quantal Response Equilibria, and Two-Player Zero-Sum Games. ICLR 2023.</w:t>
+        <w:t>[11] Timbers, F., Bard, N., Lockhart, E., Lanctot, M., Schmid, M., Burch, N., Schrittwieser, J., Hubert, T., &amp; Bowling, M. (2022). Approximate Exploitability: Learning a Best Response. IJCAI 2022.</w:t>
       </w:r>
       <w:r>
         <w:rPr>
@@ -2134,32 +2069,6 @@
         <w:t xml:space="preserve"> </w:t>
       </w:r>
       <w:hyperlink r:id="rId20">
-        <w:r>
-          <w:rPr>
-            <w:color w:val="24567A"/>
-            <w:sz w:val="18"/>
-          </w:rPr>
-          <w:t>原文链接</w:t>
-        </w:r>
-      </w:hyperlink>
-    </w:p>
-    <w:p>
-      <w:pPr>
-        <w:spacing w:after="100" w:line="264" w:lineRule="auto"/>
-      </w:pPr>
-      <w:r>
-        <w:rPr>
-          <w:sz w:val="18"/>
-        </w:rPr>
-        <w:t>[12] Timbers, F., Bard, N., Lockhart, E., Lanctot, M., Schmid, M., Burch, N., Schrittwieser, J., Hubert, T., &amp; Bowling, M. (2022). Approximate Exploitability: Learning a Best Response. IJCAI 2022.</w:t>
-      </w:r>
-      <w:r>
-        <w:rPr>
-          <w:sz w:val="18"/>
-        </w:rPr>
-        <w:t xml:space="preserve"> </w:t>
-      </w:r>
-      <w:hyperlink r:id="rId21">
         <w:r>
           <w:rPr>
             <w:color w:val="24567A"/>

</xml_diff>

<commit_message>
Docs: implemented details of the five-slot protocol, message encoder and GPU update
Co-Authored-By: Claude Opus 5.5 <noreply@anthropic.com>
</commit_message>
<xml_diff>
--- a/docs/Avalon_Implementation_Spec.docx
+++ b/docs/Avalon_Implementation_Spec.docx
@@ -895,7 +895,7 @@
               <w:rPr>
                 <w:sz w:val="19"/>
               </w:rPr>
-              <w:t>刺杀阶段只开放此槽，取值改为是否梅林候选</w:t>
+              <w:t>刺杀阶段只开放此槽，取值改为“是梅林 / 不是梅林”，只能评价好人</w:t>
             </w:r>
           </w:p>
         </w:tc>
@@ -1051,7 +1051,7 @@
               <w:rPr>
                 <w:sz w:val="19"/>
               </w:rPr>
-              <w:t>队长固定为其提案</w:t>
+              <w:t>队长固定为其提案（该槽存在时，测试时静默也不改变）</w:t>
             </w:r>
           </w:p>
         </w:tc>
@@ -1180,7 +1180,49 @@
         <w:t>训练后关闭信道：</w:t>
       </w:r>
       <w:r>
-        <w:t>F → S 与 M → S 实现为强制所有槽位“不说”，不引入训练中从未出现的新 NULL 符号，以减轻分布外输入。</w:t>
+        <w:t>F → S 与 M → S 实现为强制所有槽位“不说”，不引入训练中从未出现的新 NULL 符号，以减轻分布外输入。观察中的“槽位存在”标志保持训练时的配置，所以被静默的槽位与主动选择“不说”看起来完全一样。队长的组队建议只是复述提案，静默时也保留。</w:t>
+      </w:r>
+    </w:p>
+    <w:p>
+      <w:pPr>
+        <w:pStyle w:val="ListBullet"/>
+      </w:pPr>
+      <w:r>
+        <w:rPr>
+          <w:b/>
+        </w:rPr>
+        <w:t>真实事件：</w:t>
+      </w:r>
+      <w:r>
+        <w:t>任务记录要求被评价者参加过该轮已完成的任务；投票记录要求该轮已有投票；组队记录要求被评价者在该轮当过队长或在某个提案队伍中（含正在讨论的提案）。身份视野与“无依据”不需要轮次。</w:t>
+      </w:r>
+    </w:p>
+    <w:p>
+      <w:pPr>
+        <w:pStyle w:val="ListBullet"/>
+      </w:pPr>
+      <w:r>
+        <w:rPr>
+          <w:b/>
+        </w:rPr>
+        <w:t>发言顺序：</w:t>
+      </w:r>
+      <w:r>
+        <w:t>每次提案后从队长开始向左依次发言；刺杀前莫甘娜先说、刺客后说，然后刺客刺杀。</w:t>
+      </w:r>
+    </w:p>
+    <w:p>
+      <w:pPr>
+        <w:pStyle w:val="ListBullet"/>
+      </w:pPr>
+      <w:r>
+        <w:rPr>
+          <w:b/>
+        </w:rPr>
+        <w:t>规则玩家：</w:t>
+      </w:r>
+      <w:r>
+        <w:t>通信配置中的规则对手不发言（队长的组队建议除外），也不读消息，作为固定参照。</w:t>
       </w:r>
     </w:p>
     <w:p>
@@ -1230,7 +1272,7 @@
         <w:t>为什么不用循环网络：</w:t>
       </w:r>
       <w:r>
-        <w:t>一局的公开历史有上限（至多 5 个任务 × 5 次提案），把它连同私有信息与自己的任务牌完整编码成固定长度向量（沉默配置为 615 维），就是一个完整的信息状态，前馈网络即可，不需要 GRU。这样也省去了 BPTT 和 hidden state 管理，RQ3 的遮蔽干预可以直接修改向量字段。通信配置的消息记录同样按提案定长编码；若维度过大，再考虑在提案序列上使用循环网络或注意力。</w:t>
+        <w:t>一局的公开历史有上限（至多 5 个任务 × 5 次提案），把它连同私有信息与自己的任务牌完整编码成固定长度向量（沉默配置为 615 维），就是一个完整的信息状态，前馈网络即可，不需要 GRU。这样也省去了 BPTT 和 hidden state 管理，RQ3 的遮蔽干预可以直接修改向量字段。通信配置的消息历史按（任务, 提案, 发言者）共 150 个定长槽位编码，每个槽位 85 维，经 actor 与 critic 各自的共享线性编码器（85 → 32，tanh）压缩后与沉默观察拼接，仍是完整的信息状态，不需要循环网络。</w:t>
       </w:r>
     </w:p>
     <w:p>
@@ -1258,7 +1300,7 @@
         <w:t>输出：</w:t>
       </w:r>
       <w:r>
-        <w:t>一个 30 维策略头配合合法动作掩码：非法动作的 logit 置为极小值，熵只在合法动作上计算；等价于各阶段各用一个动作头。critic 输出该玩家的状态价值。</w:t>
+        <w:t>一个 30 维策略头配合合法动作掩码：非法动作的 logit 置为极小值，熵只在合法动作上计算；等价于各阶段各用一个动作头。通信配置另有 19 个消息头（共 99 个取值）：依据类型在阵营判断之后、轮次在依据类型之后按掩码依次采样。critic 输出该玩家的状态价值。</w:t>
       </w:r>
     </w:p>
     <w:p>
@@ -1570,7 +1612,7 @@
         <w:t>配对：</w:t>
       </w:r>
       <w:r>
-        <w:t>各条件使用相同的角色分配与初始队长表，策略采样用独立随机流；评估中没有训练更新与跨局记忆。</w:t>
+        <w:t>各条件使用相同的角色分配与初始队长表，策略采样用由评估种子决定的独立随机流，评估结果可完全复现；评估中没有训练更新与跨局记忆。</w:t>
       </w:r>
     </w:p>
     <w:p>
@@ -1689,7 +1731,7 @@
         <w:t>预算：</w:t>
       </w:r>
       <w:r>
-        <w:t>训练时间约为 配置数 × 种子数 × B × 每局训练耗时（分支设计下前半段共享），另加调参与评估。实测 3 个种子并行时每 50 万局约 2–2.5 小时，完整的 150 万局约 6 小时。超出预算时先减小 B，保留种子数。</w:t>
+        <w:t>训练时间约为 配置数 × 种子数 × B × 每局训练耗时（分支设计下前半段共享），另加调参与评估。实测沉默配置 3 个种子并行时每 50 万局约 2–2.5 小时，完整的 150 万局约 6 小时。通信配置每局决策约多一倍、观察约大 20 倍，PPO 更新改在 GPU 上运行：远程实测每次迭代采集约 10 秒、更新约 4 秒，分支后 1,470 次迭代约 6 小时。超出预算时先减小 B，保留种子数。</w:t>
       </w:r>
     </w:p>
     <w:p>

</xml_diff>

<commit_message>
Docs: communication design v2 (one discussion per quest, 8-value judgments, coherent rationale, vetoes)
Co-Authored-By: Claude Opus 5.5 <noreply@anthropic.com>
</commit_message>
<xml_diff>
--- a/docs/Avalon_Implementation_Spec.docx
+++ b/docs/Avalon_Implementation_Spec.docx
@@ -653,9 +653,9 @@
       </w:tblPr>
       <w:tblGrid>
         <w:gridCol w:w="1440"/>
-        <w:gridCol w:w="3384"/>
-        <w:gridCol w:w="1656"/>
-        <w:gridCol w:w="3182"/>
+        <w:gridCol w:w="2880"/>
+        <w:gridCol w:w="1296"/>
+        <w:gridCol w:w="4046"/>
       </w:tblGrid>
       <w:tr>
         <w:trPr>
@@ -685,7 +685,7 @@
         </w:tc>
         <w:tc>
           <w:tcPr>
-            <w:tcW w:type="dxa" w:w="3384"/>
+            <w:tcW w:type="dxa" w:w="2880"/>
             <w:vAlign w:val="center"/>
             <w:shd w:fill="E6EDF3"/>
           </w:tcPr>
@@ -705,7 +705,7 @@
         </w:tc>
         <w:tc>
           <w:tcPr>
-            <w:tcW w:type="dxa" w:w="1656"/>
+            <w:tcW w:type="dxa" w:w="1296"/>
             <w:vAlign w:val="center"/>
             <w:shd w:fill="E6EDF3"/>
           </w:tcPr>
@@ -725,7 +725,7 @@
         </w:tc>
         <w:tc>
           <w:tcPr>
-            <w:tcW w:type="dxa" w:w="3182"/>
+            <w:tcW w:type="dxa" w:w="4046"/>
             <w:vAlign w:val="center"/>
             <w:shd w:fill="E6EDF3"/>
           </w:tcPr>
@@ -769,7 +769,7 @@
         </w:tc>
         <w:tc>
           <w:tcPr>
-            <w:tcW w:type="dxa" w:w="3384"/>
+            <w:tcW w:type="dxa" w:w="2880"/>
             <w:vAlign w:val="center"/>
           </w:tcPr>
           <w:p>
@@ -787,7 +787,7 @@
         </w:tc>
         <w:tc>
           <w:tcPr>
-            <w:tcW w:type="dxa" w:w="1656"/>
+            <w:tcW w:type="dxa" w:w="1296"/>
             <w:vAlign w:val="center"/>
           </w:tcPr>
           <w:p>
@@ -805,7 +805,7 @@
         </w:tc>
         <w:tc>
           <w:tcPr>
-            <w:tcW w:type="dxa" w:w="3182"/>
+            <w:tcW w:type="dxa" w:w="4046"/>
             <w:vAlign w:val="center"/>
           </w:tcPr>
           <w:p>
@@ -847,7 +847,7 @@
         </w:tc>
         <w:tc>
           <w:tcPr>
-            <w:tcW w:type="dxa" w:w="3384"/>
+            <w:tcW w:type="dxa" w:w="2880"/>
             <w:vAlign w:val="center"/>
           </w:tcPr>
           <w:p>
@@ -859,13 +859,13 @@
               <w:rPr>
                 <w:sz w:val="19"/>
               </w:rPr>
-              <w:t>5 个分类头，每名其他玩家一个</w:t>
+              <w:t>5 个分类头，每名其他玩家一个，按座位依次采样</w:t>
             </w:r>
           </w:p>
         </w:tc>
         <w:tc>
           <w:tcPr>
-            <w:tcW w:type="dxa" w:w="1656"/>
+            <w:tcW w:type="dxa" w:w="1296"/>
             <w:vAlign w:val="center"/>
           </w:tcPr>
           <w:p>
@@ -877,13 +877,13 @@
               <w:rPr>
                 <w:sz w:val="19"/>
               </w:rPr>
-              <w:t>每个 3</w:t>
+              <w:t>每个 8</w:t>
             </w:r>
           </w:p>
         </w:tc>
         <w:tc>
           <w:tcPr>
-            <w:tcW w:type="dxa" w:w="3182"/>
+            <w:tcW w:type="dxa" w:w="4046"/>
             <w:vAlign w:val="center"/>
           </w:tcPr>
           <w:p>
@@ -895,7 +895,7 @@
               <w:rPr>
                 <w:sz w:val="19"/>
               </w:rPr>
-              <w:t>刺杀阶段只开放此槽，取值改为“是梅林 / 不是梅林”，只能评价好人</w:t>
+              <w:t>连同声明不超过牌堆：梅林、派西维尔、莫甘娜、刺客各至多 1 人，忠臣至多 2 人，判坏至多 2 人、判好至多 4 人；刺杀前只能把好人判为忠臣、梅林或派西维尔</w:t>
             </w:r>
           </w:p>
         </w:tc>
@@ -925,7 +925,7 @@
         </w:tc>
         <w:tc>
           <w:tcPr>
-            <w:tcW w:type="dxa" w:w="3384"/>
+            <w:tcW w:type="dxa" w:w="2880"/>
             <w:vAlign w:val="center"/>
           </w:tcPr>
           <w:p>
@@ -943,7 +943,7 @@
         </w:tc>
         <w:tc>
           <w:tcPr>
-            <w:tcW w:type="dxa" w:w="1656"/>
+            <w:tcW w:type="dxa" w:w="1296"/>
             <w:vAlign w:val="center"/>
           </w:tcPr>
           <w:p>
@@ -955,13 +955,13 @@
               <w:rPr>
                 <w:sz w:val="19"/>
               </w:rPr>
-              <w:t>类型 5，轮次至多 5</w:t>
+              <w:t>类型 5，轮次 5</w:t>
             </w:r>
           </w:p>
         </w:tc>
         <w:tc>
           <w:tcPr>
-            <w:tcW w:type="dxa" w:w="3182"/>
+            <w:tcW w:type="dxa" w:w="4046"/>
             <w:vAlign w:val="center"/>
           </w:tcPr>
           <w:p>
@@ -973,7 +973,7 @@
               <w:rPr>
                 <w:sz w:val="19"/>
               </w:rPr>
-              <w:t>② 为“不评”时屏蔽；公开记录类只能选真实发生的事件</w:t>
+              <w:t>② 为“不评”时不使用；记录类依据须指向与判断同方向的已结束任务；身份视野：判好/坏须声称梅林或未声明，判梅林/莫甘娜须声称派西维尔或未声明</w:t>
             </w:r>
           </w:p>
         </w:tc>
@@ -1003,7 +1003,7 @@
         </w:tc>
         <w:tc>
           <w:tcPr>
-            <w:tcW w:type="dxa" w:w="3384"/>
+            <w:tcW w:type="dxa" w:w="2880"/>
             <w:vAlign w:val="center"/>
           </w:tcPr>
           <w:p>
@@ -1021,7 +1021,7 @@
         </w:tc>
         <w:tc>
           <w:tcPr>
-            <w:tcW w:type="dxa" w:w="1656"/>
+            <w:tcW w:type="dxa" w:w="1296"/>
             <w:vAlign w:val="center"/>
           </w:tcPr>
           <w:p>
@@ -1039,7 +1039,7 @@
         </w:tc>
         <w:tc>
           <w:tcPr>
-            <w:tcW w:type="dxa" w:w="3182"/>
+            <w:tcW w:type="dxa" w:w="4046"/>
             <w:vAlign w:val="center"/>
           </w:tcPr>
           <w:p>
@@ -1051,7 +1051,7 @@
               <w:rPr>
                 <w:sz w:val="19"/>
               </w:rPr>
-              <w:t>队长固定为其提案（该槽存在时，测试时静默也不改变）</w:t>
+              <w:t>不能包含本条消息判为坏的人；队长不提建议</w:t>
             </w:r>
           </w:p>
         </w:tc>
@@ -1080,7 +1080,7 @@
         </w:tc>
         <w:tc>
           <w:tcPr>
-            <w:tcW w:type="dxa" w:w="3384"/>
+            <w:tcW w:type="dxa" w:w="2880"/>
             <w:vAlign w:val="center"/>
           </w:tcPr>
           <w:p>
@@ -1091,13 +1091,13 @@
               <w:rPr>
                 <w:sz w:val="19"/>
               </w:rPr>
-              <w:t>投票倾向头与点名头</w:t>
+              <w:t>5 个分类头，每名其他玩家一个</w:t>
             </w:r>
           </w:p>
         </w:tc>
         <w:tc>
           <w:tcPr>
-            <w:tcW w:type="dxa" w:w="1656"/>
+            <w:tcW w:type="dxa" w:w="1296"/>
             <w:vAlign w:val="center"/>
           </w:tcPr>
           <w:p>
@@ -1108,13 +1108,13 @@
               <w:rPr>
                 <w:sz w:val="19"/>
               </w:rPr>
-              <w:t>3；至多 6</w:t>
+              <w:t>每个 2</w:t>
             </w:r>
           </w:p>
         </w:tc>
         <w:tc>
           <w:tcPr>
-            <w:tcW w:type="dxa" w:w="3182"/>
+            <w:tcW w:type="dxa" w:w="4046"/>
             <w:vAlign w:val="center"/>
           </w:tcPr>
           <w:p>
@@ -1125,7 +1125,7 @@
               <w:rPr>
                 <w:sz w:val="19"/>
               </w:rPr>
-              <w:t>点名只限本轮尚未发言的玩家</w:t>
+              <w:t>不能否决本条消息判为好的人或自己建议队伍中的人</w:t>
             </w:r>
           </w:p>
         </w:tc>
@@ -1152,7 +1152,7 @@
         <w:t>“不说”：</w:t>
       </w:r>
       <w:r>
-        <w:t>每个槽位的第一个取值即“不说”（不声明、不评、不建议、不表态、不点名）。</w:t>
+        <w:t>每个头的第一个取值即“不说”（不声明、不评、无依据、不建议、不否决）。</w:t>
       </w:r>
     </w:p>
     <w:p>
@@ -1166,7 +1166,7 @@
         <w:t>关闭与不说要区分：</w:t>
       </w:r>
       <w:r>
-        <w:t>关闭的槽位强制“不说”，不进入损失；观察中编码为“关闭”，与主动选择“不说”区分开。</w:t>
+        <w:t>关闭的槽位强制“不说”，不进入损失；观察中的“槽位存在”标志记录训练配置，与主动选择“不说”区分开。</w:t>
       </w:r>
     </w:p>
     <w:p>
@@ -1180,7 +1180,7 @@
         <w:t>训练后关闭信道：</w:t>
       </w:r>
       <w:r>
-        <w:t>F → S 与 M → S 实现为强制所有槽位“不说”，不引入训练中从未出现的新 NULL 符号，以减轻分布外输入。观察中的“槽位存在”标志保持训练时的配置，所以被静默的槽位与主动选择“不说”看起来完全一样。队长的组队建议只是复述提案，静默时也保留。</w:t>
+        <w:t>F → S 与 M → S 实现为强制所有槽位“不说”，不引入训练中从未出现的新 NULL 符号，以减轻分布外输入。被静默的槽位与主动选择“不说”看起来完全一样。</w:t>
       </w:r>
     </w:p>
     <w:p>
@@ -1191,10 +1191,10 @@
         <w:rPr>
           <w:b/>
         </w:rPr>
-        <w:t>真实事件：</w:t>
+        <w:t>记录依据的方向：</w:t>
       </w:r>
       <w:r>
-        <w:t>任务记录要求被评价者参加过该轮已完成的任务；投票记录要求该轮已有投票；组队记录要求被评价者在该轮当过队长或在某个提案队伍中（含正在讨论的提案）。身份视野与“无依据”不需要轮次。</w:t>
+        <w:t>任务记录：被评价者在第 q 轮任务队中，任务失败指向坏、成功指向好。投票记录：他赞成了第 q 轮最终失败的队伍或否决了最终成功的队伍指向坏，反之指向好。组队记录：他是第 q 轮出任务队伍的队长，失败指向坏、成功指向好。只引用已结束的任务。</w:t>
       </w:r>
     </w:p>
     <w:p>
@@ -1208,7 +1208,7 @@
         <w:t>发言顺序：</w:t>
       </w:r>
       <w:r>
-        <w:t>每次提案后从队长开始向左依次发言；刺杀前莫甘娜先说、刺客后说，然后刺客刺杀。</w:t>
+        <w:t>每轮任务开始时从队长左手边开始依次发言，队长最后；队长随后正式组队。被否决后的组队不讨论。刺杀前莫甘娜先说、刺客后说，然后刺客刺杀。</w:t>
       </w:r>
     </w:p>
     <w:p>
@@ -1222,7 +1222,7 @@
         <w:t>规则玩家：</w:t>
       </w:r>
       <w:r>
-        <w:t>通信配置中的规则对手不发言（队长的组队建议除外），也不读消息，作为固定参照。</w:t>
+        <w:t>通信配置中的规则对手不发言，也不读消息，作为固定参照。</w:t>
       </w:r>
     </w:p>
     <w:p>
@@ -1236,7 +1236,7 @@
         <w:t>存储与渲染：</w:t>
       </w:r>
       <w:r>
-        <w:t>消息以槽位元组存储；可用模板渲染成句子以便阅读，例如“我是派西维尔。我认为 3 号是坏人，因为第 2 轮任务失败时他在队里。我建议 1、2、5 号上车。我反对当前队伍，请 4 号回应。”</w:t>
+        <w:t>消息以槽位元组存储；可用模板渲染成句子以便阅读，例如“我是派西维尔。我认为 3 号是坏人，因为第 2 轮任务失败时他在队里；5 号是梅林，依据是我的视野。我建议 1、2、5 号上车。这一轮只要 3 号在队里我就否决。”</w:t>
       </w:r>
     </w:p>
     <w:p>
@@ -1272,7 +1272,7 @@
         <w:t>为什么不用循环网络：</w:t>
       </w:r>
       <w:r>
-        <w:t>一局的公开历史有上限（至多 5 个任务 × 5 次提案），把它连同私有信息与自己的任务牌完整编码成固定长度向量（沉默配置为 615 维），就是一个完整的信息状态，前馈网络即可，不需要 GRU。这样也省去了 BPTT 和 hidden state 管理，RQ3 的遮蔽干预可以直接修改向量字段。通信配置的消息历史按（任务, 提案, 发言者）共 150 个定长槽位编码，每个槽位 85 维，经 actor 与 critic 各自的共享线性编码器（85 → 32，tanh）压缩后与沉默观察拼接，仍是完整的信息状态，不需要循环网络。</w:t>
+        <w:t>一局的公开历史有上限（至多 5 个任务 × 5 次提案），把它连同私有信息与自己的任务牌完整编码成固定长度向量（沉默配置为 615 维），就是一个完整的信息状态，前馈网络即可，不需要 GRU。这样也省去了 BPTT 和 hidden state 管理，RQ3 的遮蔽干预可以直接修改向量字段。通信配置的消息历史按（任务, 发言者）加刺杀前讨论共 36 个定长槽位编码，每个槽位 113 维，经 actor 与 critic 各自的共享线性编码器（113 → 32，tanh）压缩后与沉默观察拼接，仍是完整的信息状态，不需要循环网络。</w:t>
       </w:r>
     </w:p>
     <w:p>
@@ -1300,7 +1300,7 @@
         <w:t>输出：</w:t>
       </w:r>
       <w:r>
-        <w:t>一个 30 维策略头配合合法动作掩码：非法动作的 logit 置为极小值，熵只在合法动作上计算；等价于各阶段各用一个动作头。通信配置另有 19 个消息头（共 99 个取值）：依据类型在阵营判断之后、轮次在依据类型之后按掩码依次采样。critic 输出该玩家的状态价值。</w:t>
+        <w:t>一个 30 维策略头配合合法动作掩码：非法动作的 logit 置为极小值，熵只在合法动作上计算；等价于各阶段各用一个动作头。通信配置另有 22 个消息头（共 125 个取值），分两段采样：先采样身份声明与阵营判断；再采样依据、组队建议与行动倾向，这些头的 logit 以前一段的选择为条件（独热编码经一层线性映射加到最后一层隐藏表示上，分支时为零），并受一致性掩码约束。critic 输出该玩家的状态价值。</w:t>
       </w:r>
     </w:p>
     <w:p>

</xml_diff>

<commit_message>
Communication: action intent slot with veto, require, bind and blame
Slot (5) now takes one of five values per other player: none; veto (reject any team with r this round);
require (reject any team without r); bind (r and I go together, reject teams with exactly one of us);
blame (if this round's quest fails with r on it, reject teams with r from then on). Intents cannot
contradict the judgments, and the vote conditions must be jointly satisfiable by some team of the
current size and by the speaker's own suggestion. Message features 113 -> 131, message logits 125 -> 140.

Co-Authored-By: Claude Opus 5.5 <noreply@anthropic.com>
</commit_message>
<xml_diff>
--- a/docs/Avalon_Implementation_Spec.docx
+++ b/docs/Avalon_Implementation_Spec.docx
@@ -1091,7 +1091,7 @@
               <w:rPr>
                 <w:sz w:val="19"/>
               </w:rPr>
-              <w:t>5 个分类头，每名其他玩家一个</w:t>
+              <w:t>5 个分类头，每名其他玩家一个，按座位依次采样</w:t>
             </w:r>
           </w:p>
         </w:tc>
@@ -1108,7 +1108,7 @@
               <w:rPr>
                 <w:sz w:val="19"/>
               </w:rPr>
-              <w:t>每个 2</w:t>
+              <w:t>每个 5</w:t>
             </w:r>
           </w:p>
         </w:tc>
@@ -1125,7 +1125,7 @@
               <w:rPr>
                 <w:sz w:val="19"/>
               </w:rPr>
-              <w:t>不能否决本条消息判为好的人或自己建议队伍中的人</w:t>
+              <w:t>无、条件否决、要人、绑票、失败追责。不能否决本条消息判为好的人，不能要人或绑票判为坏的人；否决、要人、绑票三类投票条件须至少有一支当前人数的队伍同时满足，有组队建议时建议本身须满足（逐座位采样时检查可满足性，保证整条消息一致）</w:t>
             </w:r>
           </w:p>
         </w:tc>
@@ -1152,7 +1152,7 @@
         <w:t>“不说”：</w:t>
       </w:r>
       <w:r>
-        <w:t>每个头的第一个取值即“不说”（不声明、不评、无依据、不建议、不否决）。</w:t>
+        <w:t>每个头的第一个取值即“不说”（不声明、不评、无依据、不建议、无倾向）。</w:t>
       </w:r>
     </w:p>
     <w:p>
@@ -1236,7 +1236,7 @@
         <w:t>存储与渲染：</w:t>
       </w:r>
       <w:r>
-        <w:t>消息以槽位元组存储；可用模板渲染成句子以便阅读，例如“我是派西维尔。我认为 3 号是坏人，因为第 2 轮任务失败时他在队里；5 号是梅林，依据是我的视野。我建议 1、2、5 号上车。这一轮只要 3 号在队里我就否决。”</w:t>
+        <w:t>消息以槽位元组存储；可用模板渲染成句子以便阅读，例如“我是派西维尔。我认为 3 号是坏人，因为第 2 轮任务失败时他在队里；5 号是梅林，依据是我的视野。我建议我和 1、5 号上车。这一轮只要 3 号在队里我就否决；我和 5 号绑票；如果这车失败而 1 号在车上，之后有 1 号的队我都否决。”</w:t>
       </w:r>
     </w:p>
     <w:p>
@@ -1272,7 +1272,7 @@
         <w:t>为什么不用循环网络：</w:t>
       </w:r>
       <w:r>
-        <w:t>一局的公开历史有上限（至多 5 个任务 × 5 次提案），把它连同私有信息与自己的任务牌完整编码成固定长度向量（沉默配置为 615 维），就是一个完整的信息状态，前馈网络即可，不需要 GRU。这样也省去了 BPTT 和 hidden state 管理，RQ3 的遮蔽干预可以直接修改向量字段。通信配置的消息历史按（任务, 发言者）加刺杀前讨论共 36 个定长槽位编码，每个槽位 113 维，经 actor 与 critic 各自的共享线性编码器（113 → 32，tanh）压缩后与沉默观察拼接，仍是完整的信息状态，不需要循环网络。</w:t>
+        <w:t>一局的公开历史有上限（至多 5 个任务 × 5 次提案），把它连同私有信息与自己的任务牌完整编码成固定长度向量（沉默配置为 615 维），就是一个完整的信息状态，前馈网络即可，不需要 GRU。这样也省去了 BPTT 和 hidden state 管理，RQ3 的遮蔽干预可以直接修改向量字段。通信配置的消息历史按（任务, 发言者）加刺杀前讨论共 36 个定长槽位编码，每个槽位 131 维，经 actor 与 critic 各自的共享线性编码器（131 → 32，tanh）压缩后与沉默观察拼接，仍是完整的信息状态，不需要循环网络。</w:t>
       </w:r>
     </w:p>
     <w:p>
@@ -1300,7 +1300,7 @@
         <w:t>输出：</w:t>
       </w:r>
       <w:r>
-        <w:t>一个 30 维策略头配合合法动作掩码：非法动作的 logit 置为极小值，熵只在合法动作上计算；等价于各阶段各用一个动作头。通信配置另有 22 个消息头（共 125 个取值），分两段采样：先采样身份声明与阵营判断；再采样依据、组队建议与行动倾向，这些头的 logit 以前一段的选择为条件（独热编码经一层线性映射加到最后一层隐藏表示上，分支时为零），并受一致性掩码约束。critic 输出该玩家的状态价值。</w:t>
+        <w:t>一个 30 维策略头配合合法动作掩码：非法动作的 logit 置为极小值，熵只在合法动作上计算；等价于各阶段各用一个动作头。通信配置另有 22 个消息头（共 140 个取值），分两段采样：先采样身份声明与阵营判断；再采样依据、组队建议与行动倾向，这些头的 logit 以前一段的选择为条件（独热编码经一层线性映射加到最后一层隐藏表示上，分支时为零），并受一致性掩码约束。critic 输出该玩家的状态价值。</w:t>
       </w:r>
     </w:p>
     <w:p>

</xml_diff>

<commit_message>
Training: runs sharing a GPU take turns through a machine-wide file lock
Six runs doing PPO updates on the laptop GPU at once triggered a driver firmware fault (nvlddmkm
'Graphics FECS Exception: UCODE Fatal Error', then a GPU reset) that killed every run; it reproduced
twice. With every update holding one file lock (training/gpu_lock.py) the same six runs trained without
faults. A run alone never waits.

Co-Authored-By: Claude Opus 5.5 <noreply@anthropic.com>
</commit_message>
<xml_diff>
--- a/docs/Avalon_Implementation_Spec.docx
+++ b/docs/Avalon_Implementation_Spec.docx
@@ -1731,7 +1731,21 @@
         <w:t>预算：</w:t>
       </w:r>
       <w:r>
-        <w:t>训练时间约为 配置数 × 种子数 × B × 每局训练耗时（分支设计下前半段共享），另加调参与评估。实测沉默配置 3 个种子并行时每 50 万局约 2–2.5 小时，完整的 150 万局约 6 小时。通信配置每局多约 30 条发言决策、观察约大 7 倍，PPO 更新改在 GPU 上运行：远程实测每次迭代采集约 6.5 秒、更新约 1.8 秒，分支后 1,470 次迭代约 3.5 小时（单进程）。超出预算时先减小 B，保留种子数。</w:t>
+        <w:t>训练时间约为 配置数 × 种子数 × B × 每局训练耗时（分支设计下前半段共享），另加调参与评估。实测沉默配置 3 个种子并行时每 50 万局约 2–2.5 小时，完整的 150 万局约 6 小时。通信配置每局多约 30 条发言决策、观察约大 7 倍，PPO 更新改在 GPU 上运行：单进程每次迭代采集约 7.7 秒、更新约 2.0 秒；6 个进程（M、F 各 3 个种子）并行时每次迭代约 17–19 秒，分支后 1,470 次迭代约 7 小时。超出预算时先减小 B，保留种子数。</w:t>
+      </w:r>
+    </w:p>
+    <w:p>
+      <w:pPr>
+        <w:pStyle w:val="ListBullet"/>
+      </w:pPr>
+      <w:r>
+        <w:rPr>
+          <w:b/>
+        </w:rPr>
+        <w:t>GPU 共用：</w:t>
+      </w:r>
+      <w:r>
+        <w:t>多个进程同时在 GPU 上做 PPO 更新时，这块显卡（驱动 581.42）出现固件错误（Graphics FECS Exception: UCODE Fatal Error）并被重置，所有进程一起崩溃；单进程或纯 GPU 压力测试不出现。因此所有 GPU 工作都放在一把机器级文件锁内，各进程的更新轮流进行（training/gpu_lock.py），加锁后 6 个进程并行训练无故障。</w:t>
       </w:r>
     </w:p>
     <w:p>

</xml_diff>